<commit_message>
Rename FrontEndApplicationLib to ChatHealthyLib
The library is named for the epic that first needed it, not for what it is.
The pipeline uses its Mongo utilities, its exceptions and its logging
service; so does the devops chain. It is an enterprise library.

  FrontEndApplicationLib/      -> ChatHealthyLib/
  chathealthy_frontend_lib     -> chathealthy_lib
  chathealthy-frontend-lib     -> chathealthy-lib

Every reference follows: python source and comments, deployment_architecture
.json, agile_backlog.json, engineering_rules.json, the remaining json, md,
toml, txt and Dockerfile references, the deployment-facts inventories, and
every design document in the code tree.

Nothing else is in this commit.

Co-Authored-By: Claude Opus 5 <noreply@anthropic.com>
</commit_message>
<xml_diff>
--- a/FindCare/SpecialtyFilter/SpecialtyFilterDesign_V3.docx
+++ b/FindCare/SpecialtyFilter/SpecialtyFilterDesign_V3.docx
@@ -6336,15 +6336,15 @@
           <w:sz w:val="18"/>
         </w:rPr>
         <w:br/>
-        <w:t xml:space="preserve">  COPY FrontEndApplicationLib    /app/FrontEndApplicationLib</w:t>
-      </w:r>
-      <w:r>
-        <w:rPr>
-          <w:rFonts w:ascii="Consolas" w:hAnsi="Consolas"/>
-          <w:sz w:val="18"/>
-        </w:rPr>
-        <w:br/>
-        <w:t xml:space="preserve">  RUN pip install --no-cache-dir /app/FrontEndApplicationLib</w:t>
+        <w:t xml:space="preserve">  COPY ChatHealthyLib    /app/ChatHealthyLib</w:t>
+      </w:r>
+      <w:r>
+        <w:rPr>
+          <w:rFonts w:ascii="Consolas" w:hAnsi="Consolas"/>
+          <w:sz w:val="18"/>
+        </w:rPr>
+        <w:br/>
+        <w:t xml:space="preserve">  RUN pip install --no-cache-dir /app/ChatHealthyLib</w:t>
       </w:r>
       <w:r>
         <w:rPr>

</xml_diff>